<commit_message>
Change dog name to Willie in chapter 13
Co-Authored-By: Claude Opus 4.6 (1M context) <noreply@anthropic.com>
</commit_message>
<xml_diff>
--- a/manuscript.docx
+++ b/manuscript.docx
@@ -5487,7 +5487,7 @@
         <w:pStyle w:val="BodyText"/>
       </w:pPr>
       <w:r>
-        <w:t xml:space="preserve">When we broke up and she told me to go, I had nowhere. But here’s where the strategy proved itself before I even had a name for it. There was a girl I’d met through the place where my girlfriend and I had worked. I’d been kind to her — not strategically, not with a plan, just genuinely kind. And when I needed a place, she offered me the laundry room on the back of her house.</w:t>
+        <w:t xml:space="preserve">When we broke up and she told me to go (we’re still friends, by the way — which tells you something about how this whole framework works even when relationships change shape), I had nowhere. But here’s where the strategy proved itself before I even had a name for it. There was a girl I’d met through the place where my girlfriend and I had worked. I’d been kind to her — not strategically, not with a plan, just genuinely kind. And when I needed a place, she offered me the laundry room on the back of her house.</w:t>
       </w:r>
     </w:p>
     <w:p>
@@ -7124,7 +7124,7 @@
         <w:t xml:space="preserve"> </w:t>
       </w:r>
       <w:r>
-        <w:t xml:space="preserve">The person. The actual human standing there with a life full of worries and hopes and a dog named Charlie who just had surgery.</w:t>
+        <w:t xml:space="preserve">The person. The actual human standing there with a life full of worries and hopes and a dog named Willie who just had surgery.</w:t>
       </w:r>
     </w:p>
     <w:p>

</xml_diff>

<commit_message>
Fix missing chapter numbers in titles (ch14-18)
Co-Authored-By: Claude Opus 4.6 (1M context) <noreply@anthropic.com>
</commit_message>
<xml_diff>
--- a/manuscript.docx
+++ b/manuscript.docx
@@ -7225,7 +7225,7 @@
       </w:r>
     </w:p>
     <w:bookmarkEnd w:id="68"/>
-    <w:bookmarkStart w:id="69" w:name="letting-situations-come-to-you"/>
+    <w:bookmarkStart w:id="69" w:name="X026f999015768cc9a1a79264d432610cd319bfc"/>
     <w:p>
       <w:pPr>
         <w:sectPr>
@@ -7240,7 +7240,7 @@
         <w:pStyle w:val="Heading1"/>
       </w:pPr>
       <w:r>
-        <w:t xml:space="preserve">Letting Situations Come to You</w:t>
+        <w:t xml:space="preserve">Chapter 14: Letting Situations Come to You</w:t>
       </w:r>
     </w:p>
     <w:p>
@@ -7622,7 +7622,7 @@
       </w:r>
     </w:p>
     <w:bookmarkEnd w:id="69"/>
-    <w:bookmarkStart w:id="70" w:name="the-multiplier-effect"/>
+    <w:bookmarkStart w:id="70" w:name="chapter-15-the-multiplier-effect"/>
     <w:p>
       <w:pPr>
         <w:sectPr>
@@ -7637,7 +7637,7 @@
         <w:pStyle w:val="Heading1"/>
       </w:pPr>
       <w:r>
-        <w:t xml:space="preserve">The Multiplier Effect</w:t>
+        <w:t xml:space="preserve">Chapter 15: The Multiplier Effect</w:t>
       </w:r>
     </w:p>
     <w:p>
@@ -8013,7 +8013,7 @@
       </w:r>
     </w:p>
     <w:bookmarkEnd w:id="70"/>
-    <w:bookmarkStart w:id="71" w:name="building-your-board"/>
+    <w:bookmarkStart w:id="71" w:name="chapter-16-building-your-board"/>
     <w:p>
       <w:pPr>
         <w:sectPr>
@@ -8028,7 +8028,7 @@
         <w:pStyle w:val="Heading1"/>
       </w:pPr>
       <w:r>
-        <w:t xml:space="preserve">Building Your Board</w:t>
+        <w:t xml:space="preserve">Chapter 16: Building Your Board</w:t>
       </w:r>
     </w:p>
     <w:p>
@@ -8449,7 +8449,7 @@
       </w:r>
     </w:p>
     <w:bookmarkEnd w:id="72"/>
-    <w:bookmarkStart w:id="73" w:name="social-capital-is-the-real-economy"/>
+    <w:bookmarkStart w:id="73" w:name="X76d4f985157e0d87167ccbf7713f57b0028c393"/>
     <w:p>
       <w:pPr>
         <w:sectPr>
@@ -8464,7 +8464,7 @@
         <w:pStyle w:val="Heading1"/>
       </w:pPr>
       <w:r>
-        <w:t xml:space="preserve">Social Capital Is the Real Economy</w:t>
+        <w:t xml:space="preserve">Chapter 17: Social Capital Is the Real Economy</w:t>
       </w:r>
     </w:p>
     <w:p>
@@ -8955,7 +8955,7 @@
       </w:r>
     </w:p>
     <w:bookmarkEnd w:id="73"/>
-    <w:bookmarkStart w:id="74" w:name="against-atomization"/>
+    <w:bookmarkStart w:id="74" w:name="chapter-18-against-atomization"/>
     <w:p>
       <w:pPr>
         <w:sectPr>
@@ -8970,7 +8970,7 @@
         <w:pStyle w:val="Heading1"/>
       </w:pPr>
       <w:r>
-        <w:t xml:space="preserve">Against Atomization</w:t>
+        <w:t xml:space="preserve">Chapter 18: Against Atomization</w:t>
       </w:r>
     </w:p>
     <w:p>

</xml_diff>